<commit_message>
se modofica la documentacion del proyecto
</commit_message>
<xml_diff>
--- a/GYM_UNIVERSITARIO_Sistema de Gestión de Gimnasio Universitario.docx
+++ b/GYM_UNIVERSITARIO_Sistema de Gestión de Gimnasio Universitario.docx
@@ -1205,16 +1205,48 @@
     </w:p>
     <w:p>
       <w:pPr>
+        <w:pStyle w:val="Heading4"/>
         <w:pBdr>
           <w:bottom w:color="000000" w:space="1" w:sz="6" w:val="single"/>
         </w:pBdr>
         <w:rPr/>
       </w:pPr>
       <w:r>
-        <w:rPr>
-          <w:rtl w:val="0"/>
-        </w:rPr>
-      </w:r>
+        <w:t>Destinatarios y roles de uso del software</w:t>
+      </w:r>
+    </w:p>
+    <w:p>
+      <w:pPr/>
+      <w:r>
+        <w:t>La aplicación de escritorio está concebida exclusivamente para el uso del personal administrativo del gimnasio de la Universidad de Medellín, concretamente:</w:t>
+      </w:r>
+    </w:p>
+    <w:p>
+      <w:pPr/>
+      <w:r>
+        <w:rPr>
+          <w:b/>
+        </w:rPr>
+        <w:t xml:space="preserve">Encargado de las reservas: </w:t>
+      </w:r>
+      <w:r>
+        <w:t>usuario operativo que interactúa directamente en el mostrador/recepción para registrar y dar de baja a estudiantes, programar reservas de cupos, registrar asistencias efectivas (visitas) y máquinas empleadas, comprobar disponibilidad en tiempo real y gestionar las solicitudes de prioridad de membresía.</w:t>
+      </w:r>
+    </w:p>
+    <w:p>
+      <w:pPr/>
+      <w:r>
+        <w:rPr>
+          <w:b/>
+        </w:rPr>
+        <w:t xml:space="preserve">Jefe de deportes: </w:t>
+      </w:r>
+      <w:r>
+        <w:t>usuario táctico y supervisor que analiza el comportamiento global del gimnasio mediante el panel de estadísticas y analítica deportiva (horarios pico, carreras con mayor afluencia, tiempo promedio de entrenamiento y ranking de maquinaria más utilizada) para la planificación de horarios, mantenimiento preventivo y adquisición de nuevos equipos deportivos.</w:t>
+      </w:r>
+    </w:p>
+    <w:p>
+      <w:pPr/>
     </w:p>
     <w:p>
       <w:pPr>
@@ -1609,14 +1641,8 @@
         <w:tc>
           <w:tcPr/>
           <w:p>
-            <w:pPr>
-              <w:rPr/>
-            </w:pPr>
-            <w:r>
-              <w:rPr>
-                <w:rtl w:val="0"/>
-              </w:rPr>
-              <w:t xml:space="preserve">Administrador / Sistema</w:t>
+            <w:r>
+              <w:t>Encargado de las reservas / Jefe de deportes</w:t>
             </w:r>
           </w:p>
         </w:tc>
@@ -2185,14 +2211,8 @@
         <w:tc>
           <w:tcPr/>
           <w:p>
-            <w:pPr>
-              <w:rPr/>
-            </w:pPr>
-            <w:r>
-              <w:rPr>
-                <w:rtl w:val="0"/>
-              </w:rPr>
-              <w:t xml:space="preserve">Administrador</w:t>
+            <w:r>
+              <w:t>Encargado de las reservas / Jefe de deportes</w:t>
             </w:r>
           </w:p>
         </w:tc>
@@ -2712,14 +2732,8 @@
         <w:tc>
           <w:tcPr/>
           <w:p>
-            <w:pPr>
-              <w:rPr/>
-            </w:pPr>
-            <w:r>
-              <w:rPr>
-                <w:rtl w:val="0"/>
-              </w:rPr>
-              <w:t xml:space="preserve">Estudiante / Sistema</w:t>
+            <w:r>
+              <w:t>Encargado de las reservas (a solicitud del estudiante)</w:t>
             </w:r>
           </w:p>
         </w:tc>
@@ -3235,14 +3249,8 @@
         <w:tc>
           <w:tcPr/>
           <w:p>
-            <w:pPr>
-              <w:rPr/>
-            </w:pPr>
-            <w:r>
-              <w:rPr>
-                <w:rtl w:val="0"/>
-              </w:rPr>
-              <w:t xml:space="preserve">Encargado del Gimnasio</w:t>
+            <w:r>
+              <w:t>Encargado de las reservas (control de acceso)</w:t>
             </w:r>
           </w:p>
         </w:tc>
@@ -3678,14 +3686,8 @@
         <w:tc>
           <w:tcPr/>
           <w:p>
-            <w:pPr>
-              <w:rPr/>
-            </w:pPr>
-            <w:r>
-              <w:rPr>
-                <w:rtl w:val="0"/>
-              </w:rPr>
-              <w:t xml:space="preserve">Encargado / Sistema</w:t>
+            <w:r>
+              <w:t>Jefe de deportes / Encargado de las reservas</w:t>
             </w:r>
           </w:p>
         </w:tc>
@@ -4105,14 +4107,8 @@
         <w:tc>
           <w:tcPr/>
           <w:p>
-            <w:pPr>
-              <w:rPr/>
-            </w:pPr>
-            <w:r>
-              <w:rPr>
-                <w:rtl w:val="0"/>
-              </w:rPr>
-              <w:t xml:space="preserve">Encargado / Directivos</w:t>
+            <w:r>
+              <w:t>Jefe de deportes</w:t>
             </w:r>
           </w:p>
         </w:tc>
@@ -4554,14 +4550,8 @@
         <w:tc>
           <w:tcPr/>
           <w:p>
-            <w:pPr>
-              <w:rPr/>
-            </w:pPr>
-            <w:r>
-              <w:rPr>
-                <w:rtl w:val="0"/>
-              </w:rPr>
-              <w:t xml:space="preserve">Estudiante / Sistema</w:t>
+            <w:r>
+              <w:t>Encargado de las reservas (a solicitud del estudiante)</w:t>
             </w:r>
           </w:p>
         </w:tc>
@@ -5110,14 +5100,8 @@
         <w:tc>
           <w:tcPr/>
           <w:p>
-            <w:pPr>
-              <w:rPr/>
-            </w:pPr>
-            <w:r>
-              <w:rPr>
-                <w:rtl w:val="0"/>
-              </w:rPr>
-              <w:t xml:space="preserve">Estudiante / Sistema</w:t>
+            <w:r>
+              <w:t>Encargado de las reservas (a solicitud del estudiante)</w:t>
             </w:r>
           </w:p>
         </w:tc>
@@ -5617,14 +5601,8 @@
         <w:tc>
           <w:tcPr/>
           <w:p>
-            <w:pPr>
-              <w:rPr/>
-            </w:pPr>
-            <w:r>
-              <w:rPr>
-                <w:rtl w:val="0"/>
-              </w:rPr>
-              <w:t xml:space="preserve">Sistema / Usuario</w:t>
+            <w:r>
+              <w:t>Encargado de las reservas / Jefe de deportes</w:t>
             </w:r>
           </w:p>
         </w:tc>
@@ -6124,14 +6102,8 @@
         <w:tc>
           <w:tcPr/>
           <w:p>
-            <w:pPr>
-              <w:rPr/>
-            </w:pPr>
-            <w:r>
-              <w:rPr>
-                <w:rtl w:val="0"/>
-              </w:rPr>
-              <w:t xml:space="preserve">Estudiante / Encargado</w:t>
+            <w:r>
+              <w:t>Encargado de las reservas / Jefe de deportes</w:t>
             </w:r>
           </w:p>
         </w:tc>
@@ -6632,14 +6604,8 @@
         <w:tc>
           <w:tcPr/>
           <w:p>
-            <w:pPr>
-              <w:rPr/>
-            </w:pPr>
-            <w:r>
-              <w:rPr>
-                <w:rtl w:val="0"/>
-              </w:rPr>
-              <w:t xml:space="preserve">Encargado / Analista</w:t>
+            <w:r>
+              <w:t>Jefe de deportes / Encargado de las reservas</w:t>
             </w:r>
           </w:p>
         </w:tc>
@@ -7148,14 +7114,8 @@
         <w:tc>
           <w:tcPr/>
           <w:p>
-            <w:pPr>
-              <w:rPr/>
-            </w:pPr>
-            <w:r>
-              <w:rPr>
-                <w:rtl w:val="0"/>
-              </w:rPr>
-              <w:t xml:space="preserve">Estudiante habitual</w:t>
+            <w:r>
+              <w:t>Encargado de las reservas (a solicitud del estudiante habitual)</w:t>
             </w:r>
           </w:p>
         </w:tc>
@@ -7752,14 +7712,8 @@
         <w:tc>
           <w:tcPr/>
           <w:p>
-            <w:pPr>
-              <w:rPr/>
-            </w:pPr>
-            <w:r>
-              <w:rPr>
-                <w:rtl w:val="0"/>
-              </w:rPr>
-              <w:t xml:space="preserve">Estudiante con prioridad / Sistema</w:t>
+            <w:r>
+              <w:t>Encargado de las reservas (a solicitud del estudiante)</w:t>
             </w:r>
           </w:p>
         </w:tc>
@@ -8357,14 +8311,8 @@
         <w:tc>
           <w:tcPr/>
           <w:p>
-            <w:pPr>
-              <w:rPr/>
-            </w:pPr>
-            <w:r>
-              <w:rPr>
-                <w:rtl w:val="0"/>
-              </w:rPr>
-              <w:t xml:space="preserve">Estudiante / Recepción</w:t>
+            <w:r>
+              <w:t>Encargado de las reservas / Jefe de deportes</w:t>
             </w:r>
           </w:p>
         </w:tc>
@@ -9039,14 +8987,8 @@
         <w:tc>
           <w:tcPr/>
           <w:p>
-            <w:pPr>
-              <w:rPr/>
-            </w:pPr>
-            <w:r>
-              <w:rPr>
-                <w:rtl w:val="0"/>
-              </w:rPr>
-              <w:t xml:space="preserve">Administrador / Mantenimiento</w:t>
+            <w:r>
+              <w:t>Jefe de deportes / Encargado de las reservas</w:t>
             </w:r>
           </w:p>
         </w:tc>
@@ -11248,6 +11190,41 @@
         </w:rPr>
         <w:t xml:space="preserve"> entidad central que administra el catálogo de horarios, controla el aforo máximo de 15 usuarios por franja y orquesta las reglas de negocio entre los colaboradores.</w:t>
       </w:r>
+    </w:p>
+    <w:p>
+      <w:pPr>
+        <w:pStyle w:val="Heading4"/>
+      </w:pPr>
+      <w:r>
+        <w:t>Actores del sistema</w:t>
+      </w:r>
+    </w:p>
+    <w:p>
+      <w:pPr/>
+      <w:r>
+        <w:rPr>
+          <w:b/>
+        </w:rPr>
+        <w:t xml:space="preserve">Encargado de las reservas: </w:t>
+      </w:r>
+      <w:r>
+        <w:t>Usuario operativo primario del software en la recepción del gimnasio. Gestiona el registro y baja de usuarios, atiende y formaliza las solicitudes de reserva, registra los accesos físicos (visitas) con sus tiempos de permanencia y máquinas usadas, tramita prioridades de membresía y consulta la disponibilidad en tiempo real.</w:t>
+      </w:r>
+    </w:p>
+    <w:p>
+      <w:pPr/>
+      <w:r>
+        <w:rPr>
+          <w:b/>
+        </w:rPr>
+        <w:t xml:space="preserve">Jefe de deportes: </w:t>
+      </w:r>
+      <w:r>
+        <w:t>Usuario táctico y supervisor general. Audita el aforo y la agenda de franjas horarias, analiza los reportes consolidados y monitorea los paneles analíticos interactivos (horarios pico, carreras más representativas, permanencia promedio y ranking de desgaste de maquinaria deportiva) para la toma de decisiones estratégicas de mantenimiento, presupuesto y logística.</w:t>
+      </w:r>
+    </w:p>
+    <w:p>
+      <w:pPr/>
     </w:p>
     <w:p>
       <w:pPr>

</xml_diff>